<commit_message>
V 1.0.1 - correção de bugs na documentação
</commit_message>
<xml_diff>
--- a/documentação/atividade 03.docx
+++ b/documentação/atividade 03.docx
@@ -2649,6 +2649,7 @@
     <w:p>
       <w:pPr>
         <w:spacing w:after="0" w:line="360" w:lineRule="auto"/>
+        <w:ind w:firstLine="720"/>
         <w:jc w:val="both"/>
         <w:rPr>
           <w:rFonts w:ascii="Arial" w:eastAsia="Arial" w:hAnsi="Arial" w:cs="Arial"/>
@@ -2800,6 +2801,7 @@
     <w:p>
       <w:pPr>
         <w:spacing w:after="0" w:line="360" w:lineRule="auto"/>
+        <w:ind w:firstLine="720"/>
         <w:jc w:val="both"/>
         <w:rPr>
           <w:rFonts w:ascii="Arial" w:eastAsia="Arial" w:hAnsi="Arial" w:cs="Arial"/>
@@ -2951,6 +2953,7 @@
     <w:p>
       <w:pPr>
         <w:spacing w:after="0" w:line="360" w:lineRule="auto"/>
+        <w:ind w:firstLine="720"/>
         <w:jc w:val="both"/>
         <w:rPr>
           <w:rFonts w:ascii="Arial" w:eastAsia="Arial" w:hAnsi="Arial" w:cs="Arial"/>
@@ -3111,6 +3114,7 @@
     <w:p>
       <w:pPr>
         <w:spacing w:after="0" w:line="360" w:lineRule="auto"/>
+        <w:ind w:firstLine="720"/>
         <w:jc w:val="both"/>
         <w:rPr>
           <w:rFonts w:ascii="Arial" w:eastAsia="Arial" w:hAnsi="Arial" w:cs="Arial"/>

</xml_diff>

<commit_message>
V 1.1.2 - Foi feita 3 melhorias para otimizar a dinâmica do site. Primeira: Ao apertar o botão de ver detalhes no bloco inicial da página, você é levado aos detalhes do projeto. Segundo: Ao rolar a página o elemento 'estruturas & valores' irá aparecer aos poucos para o usuário; Terceira: Foi inserida uma nova seção de confiabilidade do cliente mostrando condominios entregues, apartamentos e pessoas morando, onde os números vão subindo assim que essa parte da tela aparecer para o usuario
</commit_message>
<xml_diff>
--- a/documentação/atividade 03.docx
+++ b/documentação/atividade 03.docx
@@ -1088,41 +1088,45 @@
               <w:tab w:val="right" w:leader="dot" w:pos="9061"/>
             </w:tabs>
             <w:rPr>
-              <w:rFonts w:ascii="Arial" w:hAnsi="Arial" w:cs="Arial"/>
+              <w:rFonts w:ascii="Arial" w:eastAsiaTheme="minorEastAsia" w:hAnsi="Arial" w:cs="Arial"/>
               <w:noProof/>
+              <w:kern w:val="2"/>
               <w:sz w:val="32"/>
               <w:szCs w:val="32"/>
+              <w14:ligatures w14:val="standardContextual"/>
             </w:rPr>
           </w:pPr>
           <w:r>
             <w:rPr>
               <w:rFonts w:ascii="Arial" w:hAnsi="Arial" w:cs="Arial"/>
-              <w:sz w:val="32"/>
-              <w:szCs w:val="32"/>
+              <w:sz w:val="40"/>
+              <w:szCs w:val="40"/>
             </w:rPr>
             <w:fldChar w:fldCharType="begin"/>
           </w:r>
           <w:r>
             <w:rPr>
               <w:rFonts w:ascii="Arial" w:hAnsi="Arial" w:cs="Arial"/>
-              <w:sz w:val="32"/>
-              <w:szCs w:val="32"/>
+              <w:sz w:val="40"/>
+              <w:szCs w:val="40"/>
             </w:rPr>
             <w:instrText xml:space="preserve"> TOC \o "1-3" \h \z \u </w:instrText>
           </w:r>
           <w:r>
             <w:rPr>
               <w:rFonts w:ascii="Arial" w:hAnsi="Arial" w:cs="Arial"/>
-              <w:sz w:val="32"/>
-              <w:szCs w:val="32"/>
+              <w:sz w:val="40"/>
+              <w:szCs w:val="40"/>
             </w:rPr>
             <w:fldChar w:fldCharType="separate"/>
           </w:r>
-          <w:hyperlink w:anchor="_Toc224645141" w:history="1">
+          <w:hyperlink w:anchor="_Toc224856606" w:history="1">
             <w:r>
               <w:rPr>
                 <w:rStyle w:val="Hyperlink"/>
                 <w:rFonts w:ascii="Arial" w:eastAsia="Arial" w:hAnsi="Arial" w:cs="Arial"/>
+                <w:b/>
+                <w:bCs/>
                 <w:noProof/>
                 <w:sz w:val="32"/>
                 <w:szCs w:val="32"/>
@@ -1157,7 +1161,7 @@
                 <w:sz w:val="32"/>
                 <w:szCs w:val="32"/>
               </w:rPr>
-              <w:instrText xml:space="preserve"> PAGEREF _Toc224645141 \h </w:instrText>
+              <w:instrText xml:space="preserve"> PAGEREF _Toc224856606 \h </w:instrText>
             </w:r>
             <w:r>
               <w:rPr>
@@ -1186,7 +1190,7 @@
                 <w:sz w:val="32"/>
                 <w:szCs w:val="32"/>
               </w:rPr>
-              <w:t>4</w:t>
+              <w:t>5</w:t>
             </w:r>
             <w:r>
               <w:rPr>
@@ -1207,17 +1211,21 @@
               <w:tab w:val="right" w:leader="dot" w:pos="9061"/>
             </w:tabs>
             <w:rPr>
-              <w:rFonts w:ascii="Arial" w:hAnsi="Arial" w:cs="Arial"/>
+              <w:rFonts w:ascii="Arial" w:eastAsiaTheme="minorEastAsia" w:hAnsi="Arial" w:cs="Arial"/>
               <w:noProof/>
+              <w:kern w:val="2"/>
               <w:sz w:val="32"/>
               <w:szCs w:val="32"/>
+              <w14:ligatures w14:val="standardContextual"/>
             </w:rPr>
           </w:pPr>
-          <w:hyperlink w:anchor="_Toc224645142" w:history="1">
+          <w:hyperlink w:anchor="_Toc224856607" w:history="1">
             <w:r>
               <w:rPr>
                 <w:rStyle w:val="Hyperlink"/>
                 <w:rFonts w:ascii="Arial" w:eastAsia="Arial" w:hAnsi="Arial" w:cs="Arial"/>
+                <w:b/>
+                <w:bCs/>
                 <w:noProof/>
                 <w:sz w:val="32"/>
                 <w:szCs w:val="32"/>
@@ -1252,7 +1260,7 @@
                 <w:sz w:val="32"/>
                 <w:szCs w:val="32"/>
               </w:rPr>
-              <w:instrText xml:space="preserve"> PAGEREF _Toc224645142 \h </w:instrText>
+              <w:instrText xml:space="preserve"> PAGEREF _Toc224856607 \h </w:instrText>
             </w:r>
             <w:r>
               <w:rPr>
@@ -1281,7 +1289,7 @@
                 <w:sz w:val="32"/>
                 <w:szCs w:val="32"/>
               </w:rPr>
-              <w:t>4</w:t>
+              <w:t>5</w:t>
             </w:r>
             <w:r>
               <w:rPr>
@@ -1302,17 +1310,21 @@
               <w:tab w:val="right" w:leader="dot" w:pos="9061"/>
             </w:tabs>
             <w:rPr>
-              <w:rFonts w:ascii="Arial" w:hAnsi="Arial" w:cs="Arial"/>
+              <w:rFonts w:ascii="Arial" w:eastAsiaTheme="minorEastAsia" w:hAnsi="Arial" w:cs="Arial"/>
               <w:noProof/>
+              <w:kern w:val="2"/>
               <w:sz w:val="32"/>
               <w:szCs w:val="32"/>
+              <w14:ligatures w14:val="standardContextual"/>
             </w:rPr>
           </w:pPr>
-          <w:hyperlink w:anchor="_Toc224645143" w:history="1">
+          <w:hyperlink w:anchor="_Toc224856608" w:history="1">
             <w:r>
               <w:rPr>
                 <w:rStyle w:val="Hyperlink"/>
                 <w:rFonts w:ascii="Arial" w:eastAsia="Arial" w:hAnsi="Arial" w:cs="Arial"/>
+                <w:b/>
+                <w:bCs/>
                 <w:noProof/>
                 <w:sz w:val="32"/>
                 <w:szCs w:val="32"/>
@@ -1347,7 +1359,7 @@
                 <w:sz w:val="32"/>
                 <w:szCs w:val="32"/>
               </w:rPr>
-              <w:instrText xml:space="preserve"> PAGEREF _Toc224645143 \h </w:instrText>
+              <w:instrText xml:space="preserve"> PAGEREF _Toc224856608 \h </w:instrText>
             </w:r>
             <w:r>
               <w:rPr>
@@ -1376,7 +1388,7 @@
                 <w:sz w:val="32"/>
                 <w:szCs w:val="32"/>
               </w:rPr>
-              <w:t>5</w:t>
+              <w:t>8</w:t>
             </w:r>
             <w:r>
               <w:rPr>
@@ -1397,22 +1409,26 @@
               <w:tab w:val="right" w:leader="dot" w:pos="9061"/>
             </w:tabs>
             <w:rPr>
-              <w:rFonts w:ascii="Arial" w:hAnsi="Arial" w:cs="Arial"/>
+              <w:rFonts w:ascii="Arial" w:eastAsiaTheme="minorEastAsia" w:hAnsi="Arial" w:cs="Arial"/>
               <w:noProof/>
+              <w:kern w:val="2"/>
               <w:sz w:val="32"/>
               <w:szCs w:val="32"/>
+              <w14:ligatures w14:val="standardContextual"/>
             </w:rPr>
           </w:pPr>
-          <w:hyperlink w:anchor="_Toc224645144" w:history="1">
+          <w:hyperlink w:anchor="_Toc224856609" w:history="1">
             <w:r>
               <w:rPr>
                 <w:rStyle w:val="Hyperlink"/>
                 <w:rFonts w:ascii="Arial" w:eastAsia="Arial" w:hAnsi="Arial" w:cs="Arial"/>
-                <w:noProof/>
-                <w:sz w:val="32"/>
-                <w:szCs w:val="32"/>
-              </w:rPr>
-              <w:t>4 Estrutura do Projeto</w:t>
+                <w:b/>
+                <w:bCs/>
+                <w:noProof/>
+                <w:sz w:val="32"/>
+                <w:szCs w:val="32"/>
+              </w:rPr>
+              <w:t>4 Desenvolvimento da Página</w:t>
             </w:r>
             <w:r>
               <w:rPr>
@@ -1442,7 +1458,7 @@
                 <w:sz w:val="32"/>
                 <w:szCs w:val="32"/>
               </w:rPr>
-              <w:instrText xml:space="preserve"> PAGEREF _Toc224645144 \h </w:instrText>
+              <w:instrText xml:space="preserve"> PAGEREF _Toc224856609 \h </w:instrText>
             </w:r>
             <w:r>
               <w:rPr>
@@ -1471,7 +1487,7 @@
                 <w:sz w:val="32"/>
                 <w:szCs w:val="32"/>
               </w:rPr>
-              <w:t>5</w:t>
+              <w:t>8</w:t>
             </w:r>
             <w:r>
               <w:rPr>
@@ -1492,22 +1508,26 @@
               <w:tab w:val="right" w:leader="dot" w:pos="9061"/>
             </w:tabs>
             <w:rPr>
-              <w:rFonts w:ascii="Arial" w:hAnsi="Arial" w:cs="Arial"/>
+              <w:rFonts w:ascii="Arial" w:eastAsiaTheme="minorEastAsia" w:hAnsi="Arial" w:cs="Arial"/>
               <w:noProof/>
+              <w:kern w:val="2"/>
               <w:sz w:val="32"/>
               <w:szCs w:val="32"/>
+              <w14:ligatures w14:val="standardContextual"/>
             </w:rPr>
           </w:pPr>
-          <w:hyperlink w:anchor="_Toc224645145" w:history="1">
+          <w:hyperlink w:anchor="_Toc224856610" w:history="1">
             <w:r>
               <w:rPr>
                 <w:rStyle w:val="Hyperlink"/>
                 <w:rFonts w:ascii="Arial" w:eastAsia="Arial" w:hAnsi="Arial" w:cs="Arial"/>
-                <w:noProof/>
-                <w:sz w:val="32"/>
-                <w:szCs w:val="32"/>
-              </w:rPr>
-              <w:t>5 Desenvolvimento da Página</w:t>
+                <w:b/>
+                <w:bCs/>
+                <w:noProof/>
+                <w:sz w:val="32"/>
+                <w:szCs w:val="32"/>
+              </w:rPr>
+              <w:t>5 Versionamento com Git</w:t>
             </w:r>
             <w:r>
               <w:rPr>
@@ -1537,7 +1557,7 @@
                 <w:sz w:val="32"/>
                 <w:szCs w:val="32"/>
               </w:rPr>
-              <w:instrText xml:space="preserve"> PAGEREF _Toc224645145 \h </w:instrText>
+              <w:instrText xml:space="preserve"> PAGEREF _Toc224856610 \h </w:instrText>
             </w:r>
             <w:r>
               <w:rPr>
@@ -1566,7 +1586,7 @@
                 <w:sz w:val="32"/>
                 <w:szCs w:val="32"/>
               </w:rPr>
-              <w:t>5</w:t>
+              <w:t>9</w:t>
             </w:r>
             <w:r>
               <w:rPr>
@@ -1587,22 +1607,26 @@
               <w:tab w:val="right" w:leader="dot" w:pos="9061"/>
             </w:tabs>
             <w:rPr>
-              <w:rFonts w:ascii="Arial" w:hAnsi="Arial" w:cs="Arial"/>
+              <w:rFonts w:ascii="Arial" w:eastAsiaTheme="minorEastAsia" w:hAnsi="Arial" w:cs="Arial"/>
               <w:noProof/>
+              <w:kern w:val="2"/>
               <w:sz w:val="32"/>
               <w:szCs w:val="32"/>
+              <w14:ligatures w14:val="standardContextual"/>
             </w:rPr>
           </w:pPr>
-          <w:hyperlink w:anchor="_Toc224645146" w:history="1">
+          <w:hyperlink w:anchor="_Toc224856611" w:history="1">
             <w:r>
               <w:rPr>
                 <w:rStyle w:val="Hyperlink"/>
                 <w:rFonts w:ascii="Arial" w:eastAsia="Arial" w:hAnsi="Arial" w:cs="Arial"/>
-                <w:noProof/>
-                <w:sz w:val="32"/>
-                <w:szCs w:val="32"/>
-              </w:rPr>
-              <w:t>6 Versionamento com Git</w:t>
+                <w:b/>
+                <w:bCs/>
+                <w:noProof/>
+                <w:sz w:val="32"/>
+                <w:szCs w:val="32"/>
+              </w:rPr>
+              <w:t>6 Deploy no Vercel</w:t>
             </w:r>
             <w:r>
               <w:rPr>
@@ -1632,7 +1656,7 @@
                 <w:sz w:val="32"/>
                 <w:szCs w:val="32"/>
               </w:rPr>
-              <w:instrText xml:space="preserve"> PAGEREF _Toc224645146 \h </w:instrText>
+              <w:instrText xml:space="preserve"> PAGEREF _Toc224856611 \h </w:instrText>
             </w:r>
             <w:r>
               <w:rPr>
@@ -1661,7 +1685,7 @@
                 <w:sz w:val="32"/>
                 <w:szCs w:val="32"/>
               </w:rPr>
-              <w:t>6</w:t>
+              <w:t>9</w:t>
             </w:r>
             <w:r>
               <w:rPr>
@@ -1682,22 +1706,26 @@
               <w:tab w:val="right" w:leader="dot" w:pos="9061"/>
             </w:tabs>
             <w:rPr>
-              <w:rFonts w:ascii="Arial" w:hAnsi="Arial" w:cs="Arial"/>
+              <w:rFonts w:ascii="Arial" w:eastAsiaTheme="minorEastAsia" w:hAnsi="Arial" w:cs="Arial"/>
               <w:noProof/>
+              <w:kern w:val="2"/>
               <w:sz w:val="32"/>
               <w:szCs w:val="32"/>
+              <w14:ligatures w14:val="standardContextual"/>
             </w:rPr>
           </w:pPr>
-          <w:hyperlink w:anchor="_Toc224645147" w:history="1">
+          <w:hyperlink w:anchor="_Toc224856612" w:history="1">
             <w:r>
               <w:rPr>
                 <w:rStyle w:val="Hyperlink"/>
                 <w:rFonts w:ascii="Arial" w:eastAsia="Arial" w:hAnsi="Arial" w:cs="Arial"/>
-                <w:noProof/>
-                <w:sz w:val="32"/>
-                <w:szCs w:val="32"/>
-              </w:rPr>
-              <w:t>7 Deploy no Vercel</w:t>
+                <w:b/>
+                <w:bCs/>
+                <w:noProof/>
+                <w:sz w:val="32"/>
+                <w:szCs w:val="32"/>
+              </w:rPr>
+              <w:t>7 Anexos</w:t>
             </w:r>
             <w:r>
               <w:rPr>
@@ -1727,7 +1755,7 @@
                 <w:sz w:val="32"/>
                 <w:szCs w:val="32"/>
               </w:rPr>
-              <w:instrText xml:space="preserve"> PAGEREF _Toc224645147 \h </w:instrText>
+              <w:instrText xml:space="preserve"> PAGEREF _Toc224856612 \h </w:instrText>
             </w:r>
             <w:r>
               <w:rPr>
@@ -1756,7 +1784,7 @@
                 <w:sz w:val="32"/>
                 <w:szCs w:val="32"/>
               </w:rPr>
-              <w:t>6</w:t>
+              <w:t>10</w:t>
             </w:r>
             <w:r>
               <w:rPr>
@@ -1777,22 +1805,26 @@
               <w:tab w:val="right" w:leader="dot" w:pos="9061"/>
             </w:tabs>
             <w:rPr>
-              <w:rFonts w:ascii="Arial" w:hAnsi="Arial" w:cs="Arial"/>
+              <w:rFonts w:ascii="Arial" w:eastAsiaTheme="minorEastAsia" w:hAnsi="Arial" w:cs="Arial"/>
               <w:noProof/>
+              <w:kern w:val="2"/>
               <w:sz w:val="32"/>
               <w:szCs w:val="32"/>
+              <w14:ligatures w14:val="standardContextual"/>
             </w:rPr>
           </w:pPr>
-          <w:hyperlink w:anchor="_Toc224645148" w:history="1">
+          <w:hyperlink w:anchor="_Toc224856613" w:history="1">
             <w:r>
               <w:rPr>
                 <w:rStyle w:val="Hyperlink"/>
                 <w:rFonts w:ascii="Arial" w:eastAsia="Arial" w:hAnsi="Arial" w:cs="Arial"/>
-                <w:noProof/>
-                <w:sz w:val="32"/>
-                <w:szCs w:val="32"/>
-              </w:rPr>
-              <w:t>8 Anexos</w:t>
+                <w:b/>
+                <w:bCs/>
+                <w:noProof/>
+                <w:sz w:val="32"/>
+                <w:szCs w:val="32"/>
+              </w:rPr>
+              <w:t>REFERÊNCIAS</w:t>
             </w:r>
             <w:r>
               <w:rPr>
@@ -1822,7 +1854,7 @@
                 <w:sz w:val="32"/>
                 <w:szCs w:val="32"/>
               </w:rPr>
-              <w:instrText xml:space="preserve"> PAGEREF _Toc224645148 \h </w:instrText>
+              <w:instrText xml:space="preserve"> PAGEREF _Toc224856613 \h </w:instrText>
             </w:r>
             <w:r>
               <w:rPr>
@@ -1851,102 +1883,7 @@
                 <w:sz w:val="32"/>
                 <w:szCs w:val="32"/>
               </w:rPr>
-              <w:t>6</w:t>
-            </w:r>
-            <w:r>
-              <w:rPr>
-                <w:rFonts w:ascii="Arial" w:hAnsi="Arial" w:cs="Arial"/>
-                <w:noProof/>
-                <w:webHidden/>
-                <w:sz w:val="32"/>
-                <w:szCs w:val="32"/>
-              </w:rPr>
-              <w:fldChar w:fldCharType="end"/>
-            </w:r>
-          </w:hyperlink>
-        </w:p>
-        <w:p>
-          <w:pPr>
-            <w:pStyle w:val="Sumrio1"/>
-            <w:tabs>
-              <w:tab w:val="right" w:leader="dot" w:pos="9061"/>
-            </w:tabs>
-            <w:rPr>
-              <w:rFonts w:ascii="Arial" w:hAnsi="Arial" w:cs="Arial"/>
-              <w:noProof/>
-              <w:sz w:val="32"/>
-              <w:szCs w:val="32"/>
-            </w:rPr>
-          </w:pPr>
-          <w:hyperlink w:anchor="_Toc224645149" w:history="1">
-            <w:r>
-              <w:rPr>
-                <w:rStyle w:val="Hyperlink"/>
-                <w:rFonts w:ascii="Arial" w:eastAsia="Arial" w:hAnsi="Arial" w:cs="Arial"/>
-                <w:noProof/>
-                <w:sz w:val="32"/>
-                <w:szCs w:val="32"/>
-              </w:rPr>
-              <w:t>REFERÊNCIAS</w:t>
-            </w:r>
-            <w:r>
-              <w:rPr>
-                <w:rFonts w:ascii="Arial" w:hAnsi="Arial" w:cs="Arial"/>
-                <w:noProof/>
-                <w:webHidden/>
-                <w:sz w:val="32"/>
-                <w:szCs w:val="32"/>
-              </w:rPr>
-              <w:tab/>
-            </w:r>
-            <w:r>
-              <w:rPr>
-                <w:rFonts w:ascii="Arial" w:hAnsi="Arial" w:cs="Arial"/>
-                <w:noProof/>
-                <w:webHidden/>
-                <w:sz w:val="32"/>
-                <w:szCs w:val="32"/>
-              </w:rPr>
-              <w:fldChar w:fldCharType="begin"/>
-            </w:r>
-            <w:r>
-              <w:rPr>
-                <w:rFonts w:ascii="Arial" w:hAnsi="Arial" w:cs="Arial"/>
-                <w:noProof/>
-                <w:webHidden/>
-                <w:sz w:val="32"/>
-                <w:szCs w:val="32"/>
-              </w:rPr>
-              <w:instrText xml:space="preserve"> PAGEREF _Toc224645149 \h </w:instrText>
-            </w:r>
-            <w:r>
-              <w:rPr>
-                <w:rFonts w:ascii="Arial" w:hAnsi="Arial" w:cs="Arial"/>
-                <w:noProof/>
-                <w:webHidden/>
-                <w:sz w:val="32"/>
-                <w:szCs w:val="32"/>
-              </w:rPr>
-            </w:r>
-            <w:r>
-              <w:rPr>
-                <w:rFonts w:ascii="Arial" w:hAnsi="Arial" w:cs="Arial"/>
-                <w:noProof/>
-                <w:webHidden/>
-                <w:sz w:val="32"/>
-                <w:szCs w:val="32"/>
-              </w:rPr>
-              <w:fldChar w:fldCharType="separate"/>
-            </w:r>
-            <w:r>
-              <w:rPr>
-                <w:rFonts w:ascii="Arial" w:hAnsi="Arial" w:cs="Arial"/>
-                <w:noProof/>
-                <w:webHidden/>
-                <w:sz w:val="32"/>
-                <w:szCs w:val="32"/>
-              </w:rPr>
-              <w:t>6</w:t>
+              <w:t>10</w:t>
             </w:r>
             <w:r>
               <w:rPr>
@@ -1971,8 +1908,8 @@
               <w:rFonts w:ascii="Arial" w:hAnsi="Arial" w:cs="Arial"/>
               <w:b/>
               <w:bCs/>
-              <w:sz w:val="32"/>
-              <w:szCs w:val="32"/>
+              <w:sz w:val="40"/>
+              <w:szCs w:val="40"/>
             </w:rPr>
             <w:fldChar w:fldCharType="end"/>
           </w:r>
@@ -2154,7 +2091,7 @@
           <w:szCs w:val="24"/>
         </w:rPr>
       </w:pPr>
-      <w:bookmarkStart w:id="0" w:name="_Toc224645141"/>
+      <w:bookmarkStart w:id="0" w:name="_Toc224856606"/>
       <w:r>
         <w:rPr>
           <w:rFonts w:ascii="Arial" w:eastAsia="Arial" w:hAnsi="Arial" w:cs="Arial"/>
@@ -2318,7 +2255,7 @@
           <w:szCs w:val="24"/>
         </w:rPr>
       </w:pPr>
-      <w:bookmarkStart w:id="1" w:name="_Toc224645142"/>
+      <w:bookmarkStart w:id="1" w:name="_Toc224856607"/>
       <w:r>
         <w:rPr>
           <w:rFonts w:ascii="Arial" w:eastAsia="Arial" w:hAnsi="Arial" w:cs="Arial"/>
@@ -2540,6 +2477,7 @@
         <w:rPr>
           <w:rFonts w:ascii="Arial" w:eastAsia="Arial" w:hAnsi="Arial" w:cs="Arial"/>
         </w:rPr>
+        <w:lastRenderedPageBreak/>
         <w:t>Figura 1 – Cabeçalho e Seção Principal.</w:t>
       </w:r>
     </w:p>
@@ -2835,6 +2773,7 @@
         <w:rPr>
           <w:rFonts w:ascii="Arial" w:eastAsia="Arial" w:hAnsi="Arial" w:cs="Arial"/>
         </w:rPr>
+        <w:lastRenderedPageBreak/>
         <w:t xml:space="preserve">Figura </w:t>
       </w:r>
       <w:r>
@@ -3148,6 +3087,7 @@
         <w:rPr>
           <w:rFonts w:ascii="Arial" w:eastAsia="Arial" w:hAnsi="Arial" w:cs="Arial"/>
         </w:rPr>
+        <w:lastRenderedPageBreak/>
         <w:t xml:space="preserve">Figura </w:t>
       </w:r>
       <w:r>
@@ -3276,7 +3216,7 @@
           <w:szCs w:val="24"/>
         </w:rPr>
       </w:pPr>
-      <w:bookmarkStart w:id="2" w:name="_Toc224645143"/>
+      <w:bookmarkStart w:id="2" w:name="_Toc224856608"/>
       <w:r>
         <w:rPr>
           <w:rFonts w:ascii="Arial" w:eastAsia="Arial" w:hAnsi="Arial" w:cs="Arial"/>
@@ -3439,7 +3379,7 @@
           <w:szCs w:val="24"/>
         </w:rPr>
       </w:pPr>
-      <w:bookmarkStart w:id="3" w:name="_Toc224645145"/>
+      <w:bookmarkStart w:id="3" w:name="_Toc224856609"/>
       <w:r>
         <w:rPr>
           <w:rFonts w:ascii="Arial" w:eastAsia="Arial" w:hAnsi="Arial" w:cs="Arial"/>
@@ -3554,7 +3494,7 @@
           <w:szCs w:val="24"/>
         </w:rPr>
       </w:pPr>
-      <w:bookmarkStart w:id="5" w:name="_Toc224645146"/>
+      <w:bookmarkStart w:id="5" w:name="_Toc224856610"/>
       <w:r>
         <w:rPr>
           <w:rFonts w:ascii="Arial" w:eastAsia="Arial" w:hAnsi="Arial" w:cs="Arial"/>
@@ -3709,7 +3649,7 @@
           <w:szCs w:val="24"/>
         </w:rPr>
       </w:pPr>
-      <w:bookmarkStart w:id="6" w:name="_Toc224645147"/>
+      <w:bookmarkStart w:id="6" w:name="_Toc224856611"/>
       <w:r>
         <w:rPr>
           <w:rFonts w:ascii="Arial" w:eastAsia="Arial" w:hAnsi="Arial" w:cs="Arial"/>
@@ -4061,7 +4001,7 @@
           <w:szCs w:val="24"/>
         </w:rPr>
       </w:pPr>
-      <w:bookmarkStart w:id="7" w:name="_Toc224645148"/>
+      <w:bookmarkStart w:id="7" w:name="_Toc224856612"/>
       <w:r>
         <w:rPr>
           <w:rFonts w:ascii="Arial" w:eastAsia="Arial" w:hAnsi="Arial" w:cs="Arial"/>
@@ -4240,7 +4180,7 @@
           <w:szCs w:val="24"/>
         </w:rPr>
       </w:pPr>
-      <w:bookmarkStart w:id="8" w:name="_Toc224645149"/>
+      <w:bookmarkStart w:id="8" w:name="_Toc224856613"/>
       <w:r>
         <w:rPr>
           <w:rFonts w:ascii="Arial" w:eastAsia="Arial" w:hAnsi="Arial" w:cs="Arial"/>

</xml_diff>